<commit_message>
A new handover.md with a plan for a less expensive model (cards JJ.6, JJ.7, D.1, EX2.Q2, P.1); the review's addendum; rule 7 in the work orders
The previous standing handover is kept as handover_2026-09-22_standing_superseded.md. The
worklog records cards JJ.2c, JJ.5 and JJ.5b and their queries.

Co-Authored-By: Claude Fable 5.1 <noreply@anthropic.com>
</commit_message>
<xml_diff>
--- a/docs/review_2026-09-22.docx
+++ b/docs/review_2026-09-22.docx
@@ -2,7 +2,7 @@
 <file path=word/document.xml><?xml version="1.0" encoding="utf-8"?>
 <w:document xmlns:w="http://schemas.openxmlformats.org/wordprocessingml/2006/main" xmlns:m="http://schemas.openxmlformats.org/officeDocument/2006/math" xmlns:r="http://schemas.openxmlformats.org/officeDocument/2006/relationships" xmlns:o="urn:schemas-microsoft-com:office:office" xmlns:v="urn:schemas-microsoft-com:vml" xmlns:w10="urn:schemas-microsoft-com:office:word" xmlns:a="http://schemas.openxmlformats.org/drawingml/2006/main" xmlns:pic="http://schemas.openxmlformats.org/drawingml/2006/picture" xmlns:wp="http://schemas.openxmlformats.org/drawingml/2006/wordprocessingDrawing">
   <w:body>
-    <w:bookmarkStart w:id="15" w:name="Xc45e3ccfe570966b8270c49148f2bea22290ca3"/>
+    <w:bookmarkStart w:id="16" w:name="Xc45e3ccfe570966b8270c49148f2bea22290ca3"/>
     <w:p>
       <w:pPr>
         <w:pStyle w:val="Heading1"/>
@@ -3016,13 +3016,46 @@
       </w:r>
     </w:p>
     <w:bookmarkEnd w:id="13"/>
-    <w:bookmarkStart w:id="14" w:name="what-i-would-do-next-opinion"/>
+    <w:bookmarkStart w:id="14" w:name="X9f2a33d0cdaf220283c6c4fc05aa0732f904773"/>
     <w:p>
       <w:pPr>
         <w:pStyle w:val="Heading2"/>
       </w:pPr>
       <w:r>
-        <w:t xml:space="preserve">6 What I would do next (opinion)</w:t>
+        <w:t xml:space="preserve">5b Addendum, the same night: Jonas keeps active inference in play</w:t>
+      </w:r>
+    </w:p>
+    <w:p>
+      <w:pPr>
+        <w:pStyle w:val="FirstParagraph"/>
+      </w:pPr>
+      <w:r>
+        <w:t xml:space="preserve">Jonas:</w:t>
+      </w:r>
+      <w:r>
+        <w:t xml:space="preserve"> </w:t>
+      </w:r>
+      <w:r>
+        <w:rPr>
+          <w:i/>
+          <w:iCs/>
+        </w:rPr>
+        <w:t xml:space="preserve">“You proposed that I give up active inference as CZB. I am not willing to do that yet.”</w:t>
+      </w:r>
+      <w:r>
+        <w:t xml:space="preserve"> </w:t>
+      </w:r>
+      <w:r>
+        <w:t xml:space="preserve">Three more pre-stated cards followed (worklog entry</w:t>
+      </w:r>
+      <w:r>
+        <w:t xml:space="preserve"> </w:t>
+      </w:r>
+      <w:r>
+        <w:t xml:space="preserve">“2026-09-22 (later)”</w:t>
+      </w:r>
+      <w:r>
+        <w:t xml:space="preserve">):</w:t>
       </w:r>
     </w:p>
     <w:p>
@@ -3038,43 +3071,22 @@
           <w:b/>
           <w:bCs/>
         </w:rPr>
-        <w:t xml:space="preserve">Stop treating the Delta G line as the way to the comfort zone on these video studies.</w:t>
-      </w:r>
-      <w:r>
-        <w:t xml:space="preserve"> </w:t>
-      </w:r>
-      <w:r>
-        <w:t xml:space="preserve">Three</w:t>
-      </w:r>
-      <w:r>
-        <w:t xml:space="preserve"> </w:t>
-      </w:r>
-      <w:r>
-        <w:t xml:space="preserve">independent constructions now say the same thing: whatever is built from a braking requirement</w:t>
-      </w:r>
-      <w:r>
-        <w:t xml:space="preserve"> </w:t>
-      </w:r>
-      <w:r>
-        <w:t xml:space="preserve">is anti-ordered within matched TTC, and what the participants respond to is proximity and</w:t>
-      </w:r>
-      <w:r>
-        <w:t xml:space="preserve"> </w:t>
-      </w:r>
-      <w:r>
-        <w:t xml:space="preserve">looming. The gated looming rule remains the model; the comfort-zone deliverable (the percentile</w:t>
-      </w:r>
-      <w:r>
-        <w:t xml:space="preserve"> </w:t>
-      </w:r>
-      <w:r>
-        <w:t xml:space="preserve">over driver levels, card EL.2 after EL.Q4) has been waiting since 2026-09-03 and none of this</w:t>
-      </w:r>
-      <w:r>
-        <w:t xml:space="preserve"> </w:t>
-      </w:r>
-      <w:r>
-        <w:t xml:space="preserve">arc touched it.</w:t>
+        <w:t xml:space="preserve">JJ.2c</w:t>
+      </w:r>
+      <w:r>
+        <w:t xml:space="preserve">: card JJ.2 with the truly released flags. DROP carries over (0.3197, 0 of 24 rows), so</w:t>
+      </w:r>
+      <w:r>
+        <w:t xml:space="preserve"> </w:t>
+      </w:r>
+      <w:r>
+        <w:t xml:space="preserve">JJ.2’s verdict is now a statement about the released model as well as about the project’s</w:t>
+      </w:r>
+      <w:r>
+        <w:t xml:space="preserve"> </w:t>
+      </w:r>
+      <w:r>
+        <w:t xml:space="preserve">staging.</w:t>
       </w:r>
     </w:p>
     <w:p>
@@ -3090,25 +3102,50 @@
           <w:b/>
           <w:bCs/>
         </w:rPr>
-        <w:t xml:space="preserve">Keep one thing from the arc: the gate as a tolerance on P(conflict)</w:t>
-      </w:r>
-      <w:r>
-        <w:t xml:space="preserve"> </w:t>
-      </w:r>
-      <w:r>
-        <w:t xml:space="preserve">(S1.6). It is the first</w:t>
-      </w:r>
-      <w:r>
-        <w:t xml:space="preserve"> </w:t>
-      </w:r>
-      <w:r>
-        <w:t xml:space="preserve">place where the active-inference machinery produced card G.1’s gate without being told to, and</w:t>
-      </w:r>
-      <w:r>
-        <w:t xml:space="preserve"> </w:t>
-      </w:r>
-      <w:r>
-        <w:t xml:space="preserve">it connects to the cut-in probability that the JJ program puts at the centre.</w:t>
+        <w:t xml:space="preserve">JJ.5</w:t>
+      </w:r>
+      <w:r>
+        <w:t xml:space="preserve">: the released model’s own looming preference (the one-sided τ⁻¹ Gaussian) read alone,</w:t>
+      </w:r>
+      <w:r>
+        <w:t xml:space="preserve"> </w:t>
+      </w:r>
+      <w:r>
+        <w:t xml:space="preserve">before contact, where the other is in the ego’s path, over the fan. The intention belief does</w:t>
+      </w:r>
+      <w:r>
+        <w:t xml:space="preserve"> </w:t>
+      </w:r>
+      <w:r>
+        <w:t xml:space="preserve">supply the structure of a gate (8.5% of futures in the path pre-onset, 100% post-onset), but the</w:t>
+      </w:r>
+      <w:r>
+        <w:t xml:space="preserve"> </w:t>
+      </w:r>
+      <w:r>
+        <w:t xml:space="preserve">quantity is</w:t>
+      </w:r>
+      <w:r>
+        <w:t xml:space="preserve"> </w:t>
+      </w:r>
+      <w:r>
+        <w:rPr>
+          <w:b/>
+          <w:bCs/>
+        </w:rPr>
+        <w:t xml:space="preserve">not credited</w:t>
+      </w:r>
+      <w:r>
+        <w:t xml:space="preserve"> </w:t>
+      </w:r>
+      <w:r>
+        <w:t xml:space="preserve">(0.3156, rho(gap) +0.662): summed over the horizon it counts steps</w:t>
+      </w:r>
+      <w:r>
+        <w:t xml:space="preserve"> </w:t>
+      </w:r>
+      <w:r>
+        <w:t xml:space="preserve">before contact, like every quantity before it.</w:t>
       </w:r>
     </w:p>
     <w:p>
@@ -3124,19 +3161,131 @@
           <w:b/>
           <w:bCs/>
         </w:rPr>
-        <w:t xml:space="preserve">Correct the three argument documents before anyone else reads them.</w:t>
-      </w:r>
-      <w:r>
-        <w:t xml:space="preserve"> </w:t>
-      </w:r>
-      <w:r>
-        <w:t xml:space="preserve">They carry dated</w:t>
-      </w:r>
-      <w:r>
-        <w:t xml:space="preserve"> </w:t>
-      </w:r>
-      <w:r>
-        <w:t xml:space="preserve">banners now; the PDFs have not been rebuilt (query REV22.Q1).</w:t>
+        <w:t xml:space="preserve">JJ.5b</w:t>
+      </w:r>
+      <w:r>
+        <w:t xml:space="preserve">: the same profile read per step, at its maximum, and at the first step. None credited</w:t>
+      </w:r>
+      <w:r>
+        <w:t xml:space="preserve"> </w:t>
+      </w:r>
+      <w:r>
+        <w:t xml:space="preserve">(0.30 to 0.32). Removing the horizon sum removes the inversion (rho(gap) +0.662 → −0.228) but</w:t>
+      </w:r>
+      <w:r>
+        <w:t xml:space="preserve"> </w:t>
+      </w:r>
+      <w:r>
+        <w:t xml:space="preserve">produces no axis: the term is a TTC quantity (τ⁻¹ = Δv/gap), and a TTC threshold scores 0.1679</w:t>
+      </w:r>
+      <w:r>
+        <w:t xml:space="preserve"> </w:t>
+      </w:r>
+      <w:r>
+        <w:t xml:space="preserve">on this design against looming’s 0.1137 (</w:t>
+      </w:r>
+      <w:r>
+        <w:rPr>
+          <w:rStyle w:val="VerbatimChar"/>
+        </w:rPr>
+        <w:t xml:space="preserve">out/cutin2_field_vs_gap.md</w:t>
+      </w:r>
+      <w:r>
+        <w:t xml:space="preserve">).</w:t>
+      </w:r>
+    </w:p>
+    <w:p>
+      <w:pPr>
+        <w:pStyle w:val="FirstParagraph"/>
+      </w:pPr>
+      <w:r>
+        <w:t xml:space="preserve">The reading that follows: the</w:t>
+      </w:r>
+      <w:r>
+        <w:t xml:space="preserve"> </w:t>
+      </w:r>
+      <w:r>
+        <w:rPr>
+          <w:i/>
+          <w:iCs/>
+        </w:rPr>
+        <w:t xml:space="preserve">shape</w:t>
+      </w:r>
+      <w:r>
+        <w:t xml:space="preserve"> </w:t>
+      </w:r>
+      <w:r>
+        <w:t xml:space="preserve">of the preference is the driver parameter. The released</w:t>
+      </w:r>
+      <w:r>
+        <w:t xml:space="preserve"> </w:t>
+      </w:r>
+      <w:r>
+        <w:t xml:space="preserve">agent already observes looming (</w:t>
+      </w:r>
+      <w:r>
+        <w:rPr>
+          <w:rStyle w:val="VerbatimChar"/>
+        </w:rPr>
+        <w:t xml:space="preserve">agent.py</w:t>
+      </w:r>
+      <w:r>
+        <w:t xml:space="preserve">,</w:t>
+      </w:r>
+      <w:r>
+        <w:t xml:space="preserve"> </w:t>
+      </w:r>
+      <w:r>
+        <w:rPr>
+          <w:rStyle w:val="VerbatimChar"/>
+        </w:rPr>
+        <w:t xml:space="preserve">use_looming</w:t>
+      </w:r>
+      <w:r>
+        <w:t xml:space="preserve">), so a prior over that observation</w:t>
+      </w:r>
+      <w:r>
+        <w:t xml:space="preserve"> </w:t>
+      </w:r>
+      <w:r>
+        <w:t xml:space="preserve">channel, gated by the intention belief through a lane-overlap criterion and read over a short</w:t>
+      </w:r>
+      <w:r>
+        <w:t xml:space="preserve"> </w:t>
+      </w:r>
+      <w:r>
+        <w:t xml:space="preserve">anticipation horizon, is the construction that stays inside active inference and can reproduce</w:t>
+      </w:r>
+      <w:r>
+        <w:t xml:space="preserve"> </w:t>
+      </w:r>
+      <w:r>
+        <w:t xml:space="preserve">the gated looming rule from the model’s terms. It is card JJ.6 in</w:t>
+      </w:r>
+      <w:r>
+        <w:t xml:space="preserve"> </w:t>
+      </w:r>
+      <w:r>
+        <w:rPr>
+          <w:rStyle w:val="VerbatimChar"/>
+        </w:rPr>
+        <w:t xml:space="preserve">handover.md</w:t>
+      </w:r>
+      <w:r>
+        <w:t xml:space="preserve"> </w:t>
+      </w:r>
+      <w:r>
+        <w:t xml:space="preserve">§4.</w:t>
+      </w:r>
+    </w:p>
+    <w:bookmarkEnd w:id="14"/>
+    <w:bookmarkStart w:id="15" w:name="what-i-would-do-next-opinion"/>
+    <w:p>
+      <w:pPr>
+        <w:pStyle w:val="Heading2"/>
+      </w:pPr>
+      <w:r>
+        <w:t xml:space="preserve">6 What I would do next (opinion)</w:t>
       </w:r>
     </w:p>
     <w:p>
@@ -3144,36 +3293,98 @@
         <w:pStyle w:val="Compact"/>
         <w:numPr>
           <w:ilvl w:val="0"/>
-          <w:numId w:val="1003"/>
+          <w:numId w:val="1004"/>
         </w:numPr>
       </w:pPr>
       <w:r>
         <w:rPr>
-          <w:b/>
-          <w:bCs/>
-        </w:rPr>
-        <w:t xml:space="preserve">Rerun card JJ.2b’s planner pass with the ego on the road and the whole plan examined</w:t>
-      </w:r>
-      <w:r>
-        <w:t xml:space="preserve">, if the</w:t>
-      </w:r>
-      <w:r>
-        <w:t xml:space="preserve"> </w:t>
-      </w:r>
-      <w:r>
-        <w:t xml:space="preserve">“released planner”</w:t>
-      </w:r>
-      <w:r>
-        <w:t xml:space="preserve"> </w:t>
-      </w:r>
-      <w:r>
-        <w:t xml:space="preserve">comparison is still wanted (query RE4B.Q1). It is the only way to know what</w:t>
-      </w:r>
-      <w:r>
-        <w:t xml:space="preserve"> </w:t>
-      </w:r>
-      <w:r>
-        <w:t xml:space="preserve">the planner does on this design.</w:t>
+          <w:i/>
+          <w:iCs/>
+        </w:rPr>
+        <w:t xml:space="preserve">[Superseded the same night by Jonas’s decision to keep active inference in play; §5b and</w:t>
+      </w:r>
+      <w:r>
+        <w:rPr>
+          <w:i/>
+          <w:iCs/>
+        </w:rPr>
+        <w:t xml:space="preserve"> </w:t>
+      </w:r>
+      <w:r>
+        <w:rPr>
+          <w:rStyle w:val="VerbatimChar"/>
+          <w:i/>
+          <w:iCs/>
+        </w:rPr>
+        <w:t xml:space="preserve">handover.md</w:t>
+      </w:r>
+      <w:r>
+        <w:rPr>
+          <w:i/>
+          <w:iCs/>
+        </w:rPr>
+        <w:t xml:space="preserve"> </w:t>
+      </w:r>
+      <w:r>
+        <w:rPr>
+          <w:i/>
+          <w:iCs/>
+        </w:rPr>
+        <w:t xml:space="preserve">§4 carry the plan. Kept as written.]</w:t>
+      </w:r>
+      <w:r>
+        <w:t xml:space="preserve"> </w:t>
+      </w:r>
+      <w:r>
+        <w:rPr>
+          <w:b/>
+          <w:bCs/>
+        </w:rPr>
+        <w:t xml:space="preserve">Stop treating the Delta G line as the way</w:t>
+      </w:r>
+      <w:r>
+        <w:rPr>
+          <w:b/>
+          <w:bCs/>
+        </w:rPr>
+        <w:t xml:space="preserve"> </w:t>
+      </w:r>
+      <w:r>
+        <w:rPr>
+          <w:b/>
+          <w:bCs/>
+        </w:rPr>
+        <w:t xml:space="preserve">to the comfort zone on these video studies.</w:t>
+      </w:r>
+      <w:r>
+        <w:t xml:space="preserve"> </w:t>
+      </w:r>
+      <w:r>
+        <w:t xml:space="preserve">Three independent constructions now say the same</w:t>
+      </w:r>
+      <w:r>
+        <w:t xml:space="preserve"> </w:t>
+      </w:r>
+      <w:r>
+        <w:t xml:space="preserve">thing: whatever is built from a braking requirement is anti-ordered within matched TTC, and</w:t>
+      </w:r>
+      <w:r>
+        <w:t xml:space="preserve"> </w:t>
+      </w:r>
+      <w:r>
+        <w:t xml:space="preserve">what the participants respond to is proximity and looming. The gated looming rule remains the</w:t>
+      </w:r>
+      <w:r>
+        <w:t xml:space="preserve"> </w:t>
+      </w:r>
+      <w:r>
+        <w:t xml:space="preserve">model; the comfort-zone deliverable (the percentile over driver levels, card EL.2 after EL.Q4)</w:t>
+      </w:r>
+      <w:r>
+        <w:t xml:space="preserve"> </w:t>
+      </w:r>
+      <w:r>
+        <w:t xml:space="preserve">has been waiting since 2026-09-03 and none of this arc touched it.</w:t>
       </w:r>
     </w:p>
     <w:p>
@@ -3181,7 +3392,7 @@
         <w:pStyle w:val="Compact"/>
         <w:numPr>
           <w:ilvl w:val="0"/>
-          <w:numId w:val="1003"/>
+          <w:numId w:val="1004"/>
         </w:numPr>
       </w:pPr>
       <w:r>
@@ -3189,6 +3400,105 @@
           <w:b/>
           <w:bCs/>
         </w:rPr>
+        <w:t xml:space="preserve">Keep one thing from the arc: the gate as a tolerance on P(conflict)</w:t>
+      </w:r>
+      <w:r>
+        <w:t xml:space="preserve"> </w:t>
+      </w:r>
+      <w:r>
+        <w:t xml:space="preserve">(S1.6). It is the first</w:t>
+      </w:r>
+      <w:r>
+        <w:t xml:space="preserve"> </w:t>
+      </w:r>
+      <w:r>
+        <w:t xml:space="preserve">place where the active-inference machinery produced card G.1’s gate without being told to, and</w:t>
+      </w:r>
+      <w:r>
+        <w:t xml:space="preserve"> </w:t>
+      </w:r>
+      <w:r>
+        <w:t xml:space="preserve">it connects to the cut-in probability that the JJ program puts at the centre.</w:t>
+      </w:r>
+    </w:p>
+    <w:p>
+      <w:pPr>
+        <w:pStyle w:val="Compact"/>
+        <w:numPr>
+          <w:ilvl w:val="0"/>
+          <w:numId w:val="1004"/>
+        </w:numPr>
+      </w:pPr>
+      <w:r>
+        <w:rPr>
+          <w:b/>
+          <w:bCs/>
+        </w:rPr>
+        <w:t xml:space="preserve">Correct the three argument documents before anyone else reads them.</w:t>
+      </w:r>
+      <w:r>
+        <w:t xml:space="preserve"> </w:t>
+      </w:r>
+      <w:r>
+        <w:t xml:space="preserve">They carry dated</w:t>
+      </w:r>
+      <w:r>
+        <w:t xml:space="preserve"> </w:t>
+      </w:r>
+      <w:r>
+        <w:t xml:space="preserve">banners now; the PDFs have not been rebuilt (query REV22.Q1).</w:t>
+      </w:r>
+    </w:p>
+    <w:p>
+      <w:pPr>
+        <w:pStyle w:val="Compact"/>
+        <w:numPr>
+          <w:ilvl w:val="0"/>
+          <w:numId w:val="1004"/>
+        </w:numPr>
+      </w:pPr>
+      <w:r>
+        <w:rPr>
+          <w:b/>
+          <w:bCs/>
+        </w:rPr>
+        <w:t xml:space="preserve">Rerun card JJ.2b’s planner pass with the ego on the road and the whole plan examined</w:t>
+      </w:r>
+      <w:r>
+        <w:t xml:space="preserve">, if the</w:t>
+      </w:r>
+      <w:r>
+        <w:t xml:space="preserve"> </w:t>
+      </w:r>
+      <w:r>
+        <w:t xml:space="preserve">“released planner”</w:t>
+      </w:r>
+      <w:r>
+        <w:t xml:space="preserve"> </w:t>
+      </w:r>
+      <w:r>
+        <w:t xml:space="preserve">comparison is still wanted (query RE4B.Q1). It is the only way to know what</w:t>
+      </w:r>
+      <w:r>
+        <w:t xml:space="preserve"> </w:t>
+      </w:r>
+      <w:r>
+        <w:t xml:space="preserve">the planner does on this design.</w:t>
+      </w:r>
+    </w:p>
+    <w:p>
+      <w:pPr>
+        <w:pStyle w:val="Compact"/>
+        <w:numPr>
+          <w:ilvl w:val="0"/>
+          <w:numId w:val="1004"/>
+        </w:numPr>
+      </w:pPr>
+      <w:r>
+        <w:rPr>
+          <w:b/>
+          <w:bCs/>
+        </w:rPr>
         <w:t xml:space="preserve">Drop the parked</w:t>
       </w:r>
       <w:r>
@@ -3229,8 +3539,8 @@
         <w:t xml:space="preserve">cyclist; as it stands it rests on misquoted numbers (query REV22.Q2).</w:t>
       </w:r>
     </w:p>
-    <w:bookmarkEnd w:id="14"/>
     <w:bookmarkEnd w:id="15"/>
+    <w:bookmarkEnd w:id="16"/>
     <w:sectPr>
       <w:footnotePr>
         <w:numRestart w:val="eachSect"/>
@@ -3566,6 +3876,9 @@
     <w:abstractNumId w:val="991"/>
   </w:num>
   <w:num w:numId="1003">
+    <w:abstractNumId w:val="991"/>
+  </w:num>
+  <w:num w:numId="1004">
     <w:abstractNumId w:val="99411"/>
     <w:lvlOverride w:ilvl="0">
       <w:startOverride w:val="1"/>

</xml_diff>